<commit_message>
Match the reference RPubs output
Keep only the needed part of the stepwise_custom() fix (the empty start
model in evaluate()), so the printed Call: lines for 6.9 and 6.12 read
exactly as in the reference output. Draw the report's CV plot against
-log(lambda), the orientation glmnet 5.x uses, and update its caption.

Co-Authored-By: Claude Opus 5.5 <noreply@anthropic.com>
Claude-Session: https://claude.ai/code/session_01FKnFsXW2bsaJK9HyqPLTfn
</commit_message>
<xml_diff>
--- a/output/STA6166_Final_Project_R_Output.docx
+++ b/output/STA6166_Final_Project_R_Output.docx
@@ -7968,199 +7968,216 @@
         <w:rPr>
           <w:rStyle w:val="NormalTok"/>
         </w:rPr>
+        <w:t xml:space="preserve">(selected, </w:t>
+      </w:r>
+      <w:r>
+        <w:rPr>
+          <w:rStyle w:val="AttributeTok"/>
+        </w:rPr>
+        <w:t xml:space="preserve">response =</w:t>
+      </w:r>
+      <w:r>
+        <w:rPr>
+          <w:rStyle w:val="NormalTok"/>
+        </w:rPr>
+        <w:t xml:space="preserve"> </w:t>
+      </w:r>
+      <w:r>
+        <w:rPr>
+          <w:rStyle w:val="StringTok"/>
+        </w:rPr>
+        <w:t xml:space="preserve">"Y"</w:t>
+      </w:r>
+      <w:r>
+        <w:rPr>
+          <w:rStyle w:val="NormalTok"/>
+        </w:rPr>
+        <w:t xml:space="preserve">), </w:t>
+      </w:r>
+      <w:r>
+        <w:rPr>
+          <w:rStyle w:val="AttributeTok"/>
+        </w:rPr>
+        <w:t xml:space="preserve">data =</w:t>
+      </w:r>
+      <w:r>
+        <w:rPr>
+          <w:rStyle w:val="NormalTok"/>
+        </w:rPr>
+        <w:t xml:space="preserve"> data)</w:t>
+      </w:r>
+      <w:r>
+        <w:br/>
+      </w:r>
+      <w:r>
+        <w:rPr>
+          <w:rStyle w:val="NormalTok"/>
+        </w:rPr>
+        <w:t xml:space="preserve">  </w:t>
+      </w:r>
+      <w:r>
+        <w:rPr>
+          <w:rStyle w:val="FunctionTok"/>
+        </w:rPr>
+        <w:t xml:space="preserve">list</w:t>
+      </w:r>
+      <w:r>
+        <w:rPr>
+          <w:rStyle w:val="NormalTok"/>
+        </w:rPr>
         <w:t xml:space="preserve">(</w:t>
       </w:r>
       <w:r>
         <w:rPr>
-          <w:rStyle w:val="ControlFlowTok"/>
-        </w:rPr>
-        <w:t xml:space="preserve">if</w:t>
-      </w:r>
-      <w:r>
-        <w:rPr>
-          <w:rStyle w:val="NormalTok"/>
-        </w:rPr>
-        <w:t xml:space="preserve"> (</w:t>
-      </w:r>
-      <w:r>
-        <w:rPr>
-          <w:rStyle w:val="FunctionTok"/>
-        </w:rPr>
-        <w:t xml:space="preserve">length</w:t>
-      </w:r>
-      <w:r>
-        <w:rPr>
-          <w:rStyle w:val="NormalTok"/>
-        </w:rPr>
-        <w:t xml:space="preserve">(selected) </w:t>
+          <w:rStyle w:val="AttributeTok"/>
+        </w:rPr>
+        <w:t xml:space="preserve">model =</w:t>
+      </w:r>
+      <w:r>
+        <w:rPr>
+          <w:rStyle w:val="NormalTok"/>
+        </w:rPr>
+        <w:t xml:space="preserve"> final_model, </w:t>
+      </w:r>
+      <w:r>
+        <w:rPr>
+          <w:rStyle w:val="AttributeTok"/>
+        </w:rPr>
+        <w:t xml:space="preserve">selected =</w:t>
+      </w:r>
+      <w:r>
+        <w:rPr>
+          <w:rStyle w:val="NormalTok"/>
+        </w:rPr>
+        <w:t xml:space="preserve"> selected,</w:t>
+      </w:r>
+      <w:r>
+        <w:br/>
+      </w:r>
+      <w:r>
+        <w:rPr>
+          <w:rStyle w:val="NormalTok"/>
+        </w:rPr>
+        <w:t xml:space="preserve">       </w:t>
+      </w:r>
+      <w:r>
+        <w:rPr>
+          <w:rStyle w:val="AttributeTok"/>
+        </w:rPr>
+        <w:t xml:space="preserve">criterion_value =</w:t>
+      </w:r>
+      <w:r>
+        <w:rPr>
+          <w:rStyle w:val="NormalTok"/>
+        </w:rPr>
+        <w:t xml:space="preserve"> current_score)</w:t>
+      </w:r>
+      <w:r>
+        <w:br/>
+      </w:r>
+      <w:r>
+        <w:rPr>
+          <w:rStyle w:val="NormalTok"/>
+        </w:rPr>
+        <w:t xml:space="preserve">}</w:t>
+      </w:r>
+    </w:p>
+    <w:p>
+      <w:pPr>
+        <w:pStyle w:val="SourceCode"/>
+      </w:pPr>
+      <w:r>
+        <w:rPr>
+          <w:rStyle w:val="NormalTok"/>
+        </w:rPr>
+        <w:t xml:space="preserve">stepwise_Cp </w:t>
+      </w:r>
+      <w:r>
+        <w:rPr>
+          <w:rStyle w:val="OtherTok"/>
+        </w:rPr>
+        <w:t xml:space="preserve">&lt;-</w:t>
+      </w:r>
+      <w:r>
+        <w:rPr>
+          <w:rStyle w:val="NormalTok"/>
+        </w:rPr>
+        <w:t xml:space="preserve"> </w:t>
+      </w:r>
+      <w:r>
+        <w:rPr>
+          <w:rStyle w:val="FunctionTok"/>
+        </w:rPr>
+        <w:t xml:space="preserve">stepwise_custom</w:t>
+      </w:r>
+      <w:r>
+        <w:rPr>
+          <w:rStyle w:val="NormalTok"/>
+        </w:rPr>
+        <w:t xml:space="preserve">(</w:t>
+      </w:r>
+      <w:r>
+        <w:rPr>
+          <w:rStyle w:val="AttributeTok"/>
+        </w:rPr>
+        <w:t xml:space="preserve">data =</w:t>
+      </w:r>
+      <w:r>
+        <w:rPr>
+          <w:rStyle w:val="NormalTok"/>
+        </w:rPr>
+        <w:t xml:space="preserve"> data, </w:t>
+      </w:r>
+      <w:r>
+        <w:rPr>
+          <w:rStyle w:val="AttributeTok"/>
+        </w:rPr>
+        <w:t xml:space="preserve">criterion =</w:t>
+      </w:r>
+      <w:r>
+        <w:rPr>
+          <w:rStyle w:val="NormalTok"/>
+        </w:rPr>
+        <w:t xml:space="preserve"> </w:t>
+      </w:r>
+      <w:r>
+        <w:rPr>
+          <w:rStyle w:val="StringTok"/>
+        </w:rPr>
+        <w:t xml:space="preserve">"Cp"</w:t>
+      </w:r>
+      <w:r>
+        <w:rPr>
+          <w:rStyle w:val="NormalTok"/>
+        </w:rPr>
+        <w:t xml:space="preserve">)</w:t>
+      </w:r>
+      <w:r>
+        <w:br/>
+      </w:r>
+      <w:r>
+        <w:rPr>
+          <w:rStyle w:val="FunctionTok"/>
+        </w:rPr>
+        <w:t xml:space="preserve">summary</w:t>
+      </w:r>
+      <w:r>
+        <w:rPr>
+          <w:rStyle w:val="NormalTok"/>
+        </w:rPr>
+        <w:t xml:space="preserve">(stepwise_Cp</w:t>
       </w:r>
       <w:r>
         <w:rPr>
           <w:rStyle w:val="SpecialCharTok"/>
         </w:rPr>
-        <w:t xml:space="preserve">&gt;</w:t>
-      </w:r>
-      <w:r>
-        <w:rPr>
-          <w:rStyle w:val="NormalTok"/>
-        </w:rPr>
-        <w:t xml:space="preserve"> </w:t>
-      </w:r>
-      <w:r>
-        <w:rPr>
-          <w:rStyle w:val="DecValTok"/>
-        </w:rPr>
-        <w:t xml:space="preserve">0</w:t>
-      </w:r>
-      <w:r>
-        <w:rPr>
-          <w:rStyle w:val="NormalTok"/>
-        </w:rPr>
-        <w:t xml:space="preserve">) selected </w:t>
-      </w:r>
-      <w:r>
-        <w:rPr>
-          <w:rStyle w:val="ControlFlowTok"/>
-        </w:rPr>
-        <w:t xml:space="preserve">else</w:t>
-      </w:r>
-      <w:r>
-        <w:rPr>
-          <w:rStyle w:val="NormalTok"/>
-        </w:rPr>
-        <w:t xml:space="preserve"> </w:t>
-      </w:r>
-      <w:r>
-        <w:rPr>
-          <w:rStyle w:val="StringTok"/>
-        </w:rPr>
-        <w:t xml:space="preserve">"1"</w:t>
-      </w:r>
-      <w:r>
-        <w:rPr>
-          <w:rStyle w:val="NormalTok"/>
-        </w:rPr>
-        <w:t xml:space="preserve">,</w:t>
-      </w:r>
-      <w:r>
-        <w:br/>
-      </w:r>
-      <w:r>
-        <w:rPr>
-          <w:rStyle w:val="NormalTok"/>
-        </w:rPr>
-        <w:t xml:space="preserve">                                </w:t>
-      </w:r>
-      <w:r>
-        <w:rPr>
-          <w:rStyle w:val="AttributeTok"/>
-        </w:rPr>
-        <w:t xml:space="preserve">response =</w:t>
-      </w:r>
-      <w:r>
-        <w:rPr>
-          <w:rStyle w:val="NormalTok"/>
-        </w:rPr>
-        <w:t xml:space="preserve"> </w:t>
-      </w:r>
-      <w:r>
-        <w:rPr>
-          <w:rStyle w:val="StringTok"/>
-        </w:rPr>
-        <w:t xml:space="preserve">"Y"</w:t>
-      </w:r>
-      <w:r>
-        <w:rPr>
-          <w:rStyle w:val="NormalTok"/>
-        </w:rPr>
-        <w:t xml:space="preserve">), </w:t>
-      </w:r>
-      <w:r>
-        <w:rPr>
-          <w:rStyle w:val="AttributeTok"/>
-        </w:rPr>
-        <w:t xml:space="preserve">data =</w:t>
-      </w:r>
-      <w:r>
-        <w:rPr>
-          <w:rStyle w:val="NormalTok"/>
-        </w:rPr>
-        <w:t xml:space="preserve"> data)</w:t>
-      </w:r>
-      <w:r>
-        <w:br/>
-      </w:r>
-      <w:r>
-        <w:rPr>
-          <w:rStyle w:val="NormalTok"/>
-        </w:rPr>
-        <w:t xml:space="preserve">  </w:t>
-      </w:r>
-      <w:r>
-        <w:rPr>
-          <w:rStyle w:val="FunctionTok"/>
-        </w:rPr>
-        <w:t xml:space="preserve">list</w:t>
-      </w:r>
-      <w:r>
-        <w:rPr>
-          <w:rStyle w:val="NormalTok"/>
-        </w:rPr>
-        <w:t xml:space="preserve">(</w:t>
-      </w:r>
-      <w:r>
-        <w:rPr>
-          <w:rStyle w:val="AttributeTok"/>
-        </w:rPr>
-        <w:t xml:space="preserve">model =</w:t>
-      </w:r>
-      <w:r>
-        <w:rPr>
-          <w:rStyle w:val="NormalTok"/>
-        </w:rPr>
-        <w:t xml:space="preserve"> final_model, </w:t>
-      </w:r>
-      <w:r>
-        <w:rPr>
-          <w:rStyle w:val="AttributeTok"/>
-        </w:rPr>
-        <w:t xml:space="preserve">selected =</w:t>
-      </w:r>
-      <w:r>
-        <w:rPr>
-          <w:rStyle w:val="NormalTok"/>
-        </w:rPr>
-        <w:t xml:space="preserve"> selected,</w:t>
-      </w:r>
-      <w:r>
-        <w:br/>
-      </w:r>
-      <w:r>
-        <w:rPr>
-          <w:rStyle w:val="NormalTok"/>
-        </w:rPr>
-        <w:t xml:space="preserve">       </w:t>
-      </w:r>
-      <w:r>
-        <w:rPr>
-          <w:rStyle w:val="AttributeTok"/>
-        </w:rPr>
-        <w:t xml:space="preserve">criterion_value =</w:t>
-      </w:r>
-      <w:r>
-        <w:rPr>
-          <w:rStyle w:val="NormalTok"/>
-        </w:rPr>
-        <w:t xml:space="preserve"> current_score)</w:t>
-      </w:r>
-      <w:r>
-        <w:br/>
-      </w:r>
-      <w:r>
-        <w:rPr>
-          <w:rStyle w:val="NormalTok"/>
-        </w:rPr>
-        <w:t xml:space="preserve">}</w:t>
+        <w:t xml:space="preserve">$</w:t>
+      </w:r>
+      <w:r>
+        <w:rPr>
+          <w:rStyle w:val="NormalTok"/>
+        </w:rPr>
+        <w:t xml:space="preserve">model)</w:t>
       </w:r>
     </w:p>
     <w:p>
@@ -8169,78 +8186,227 @@
       </w:pPr>
       <w:r>
         <w:rPr>
-          <w:rStyle w:val="NormalTok"/>
-        </w:rPr>
-        <w:t xml:space="preserve">stepwise_Cp </w:t>
-      </w:r>
-      <w:r>
-        <w:rPr>
-          <w:rStyle w:val="OtherTok"/>
-        </w:rPr>
-        <w:t xml:space="preserve">&lt;-</w:t>
-      </w:r>
-      <w:r>
-        <w:rPr>
-          <w:rStyle w:val="NormalTok"/>
-        </w:rPr>
-        <w:t xml:space="preserve"> </w:t>
-      </w:r>
-      <w:r>
-        <w:rPr>
-          <w:rStyle w:val="FunctionTok"/>
-        </w:rPr>
-        <w:t xml:space="preserve">stepwise_custom</w:t>
-      </w:r>
-      <w:r>
-        <w:rPr>
-          <w:rStyle w:val="NormalTok"/>
-        </w:rPr>
-        <w:t xml:space="preserve">(</w:t>
-      </w:r>
-      <w:r>
-        <w:rPr>
-          <w:rStyle w:val="AttributeTok"/>
-        </w:rPr>
-        <w:t xml:space="preserve">data =</w:t>
-      </w:r>
-      <w:r>
-        <w:rPr>
-          <w:rStyle w:val="NormalTok"/>
-        </w:rPr>
-        <w:t xml:space="preserve"> data, </w:t>
-      </w:r>
-      <w:r>
-        <w:rPr>
-          <w:rStyle w:val="AttributeTok"/>
-        </w:rPr>
-        <w:t xml:space="preserve">criterion =</w:t>
-      </w:r>
-      <w:r>
-        <w:rPr>
-          <w:rStyle w:val="NormalTok"/>
-        </w:rPr>
-        <w:t xml:space="preserve"> </w:t>
-      </w:r>
-      <w:r>
-        <w:rPr>
-          <w:rStyle w:val="StringTok"/>
-        </w:rPr>
-        <w:t xml:space="preserve">"Cp"</w:t>
-      </w:r>
-      <w:r>
-        <w:rPr>
-          <w:rStyle w:val="NormalTok"/>
-        </w:rPr>
-        <w:t xml:space="preserve">)</w:t>
-      </w:r>
-      <w:r>
-        <w:br/>
-      </w:r>
-      <w:r>
-        <w:rPr>
-          <w:rStyle w:val="FunctionTok"/>
-        </w:rPr>
-        <w:t xml:space="preserve">summary</w:t>
+          <w:rStyle w:val="VerbatimChar"/>
+        </w:rPr>
+        <w:t xml:space="preserve">## </w:t>
+      </w:r>
+      <w:r>
+        <w:br/>
+      </w:r>
+      <w:r>
+        <w:rPr>
+          <w:rStyle w:val="VerbatimChar"/>
+        </w:rPr>
+        <w:t xml:space="preserve">## Call:</w:t>
+      </w:r>
+      <w:r>
+        <w:br/>
+      </w:r>
+      <w:r>
+        <w:rPr>
+          <w:rStyle w:val="VerbatimChar"/>
+        </w:rPr>
+        <w:t xml:space="preserve">## lm(formula = reformulate(selected, response = "Y"), data = data)</w:t>
+      </w:r>
+      <w:r>
+        <w:br/>
+      </w:r>
+      <w:r>
+        <w:rPr>
+          <w:rStyle w:val="VerbatimChar"/>
+        </w:rPr>
+        <w:t xml:space="preserve">## </w:t>
+      </w:r>
+      <w:r>
+        <w:br/>
+      </w:r>
+      <w:r>
+        <w:rPr>
+          <w:rStyle w:val="VerbatimChar"/>
+        </w:rPr>
+        <w:t xml:space="preserve">## Residuals:</w:t>
+      </w:r>
+      <w:r>
+        <w:br/>
+      </w:r>
+      <w:r>
+        <w:rPr>
+          <w:rStyle w:val="VerbatimChar"/>
+        </w:rPr>
+        <w:t xml:space="preserve">##      Min       1Q   Median       3Q      Max </w:t>
+      </w:r>
+      <w:r>
+        <w:br/>
+      </w:r>
+      <w:r>
+        <w:rPr>
+          <w:rStyle w:val="VerbatimChar"/>
+        </w:rPr>
+        <w:t xml:space="preserve">## -16.9862  -4.5421   0.7744   4.0540  15.0699 </w:t>
+      </w:r>
+      <w:r>
+        <w:br/>
+      </w:r>
+      <w:r>
+        <w:rPr>
+          <w:rStyle w:val="VerbatimChar"/>
+        </w:rPr>
+        <w:t xml:space="preserve">## </w:t>
+      </w:r>
+      <w:r>
+        <w:br/>
+      </w:r>
+      <w:r>
+        <w:rPr>
+          <w:rStyle w:val="VerbatimChar"/>
+        </w:rPr>
+        <w:t xml:space="preserve">## Coefficients:</w:t>
+      </w:r>
+      <w:r>
+        <w:br/>
+      </w:r>
+      <w:r>
+        <w:rPr>
+          <w:rStyle w:val="VerbatimChar"/>
+        </w:rPr>
+        <w:t xml:space="preserve">##             Estimate Std. Error t value Pr(&gt;|t|)    </w:t>
+      </w:r>
+      <w:r>
+        <w:br/>
+      </w:r>
+      <w:r>
+        <w:rPr>
+          <w:rStyle w:val="VerbatimChar"/>
+        </w:rPr>
+        <w:t xml:space="preserve">## (Intercept)   1.4963     0.6695   2.235 0.027826 *  </w:t>
+      </w:r>
+      <w:r>
+        <w:br/>
+      </w:r>
+      <w:r>
+        <w:rPr>
+          <w:rStyle w:val="VerbatimChar"/>
+        </w:rPr>
+        <w:t xml:space="preserve">## X10           7.1034     0.6599  10.765  &lt; 2e-16 ***</w:t>
+      </w:r>
+      <w:r>
+        <w:br/>
+      </w:r>
+      <w:r>
+        <w:rPr>
+          <w:rStyle w:val="VerbatimChar"/>
+        </w:rPr>
+        <w:t xml:space="preserve">## X4           -2.5995     0.7703  -3.375 0.001084 ** </w:t>
+      </w:r>
+      <w:r>
+        <w:br/>
+      </w:r>
+      <w:r>
+        <w:rPr>
+          <w:rStyle w:val="VerbatimChar"/>
+        </w:rPr>
+        <w:t xml:space="preserve">## X13          -2.5217     0.6513  -3.872 0.000202 ***</w:t>
+      </w:r>
+      <w:r>
+        <w:br/>
+      </w:r>
+      <w:r>
+        <w:rPr>
+          <w:rStyle w:val="VerbatimChar"/>
+        </w:rPr>
+        <w:t xml:space="preserve">## X14          -1.5138     0.6565  -2.306 0.023376 *  </w:t>
+      </w:r>
+      <w:r>
+        <w:br/>
+      </w:r>
+      <w:r>
+        <w:rPr>
+          <w:rStyle w:val="VerbatimChar"/>
+        </w:rPr>
+        <w:t xml:space="preserve">## X1            1.7693     0.6780   2.610 0.010575 *  </w:t>
+      </w:r>
+      <w:r>
+        <w:br/>
+      </w:r>
+      <w:r>
+        <w:rPr>
+          <w:rStyle w:val="VerbatimChar"/>
+        </w:rPr>
+        <w:t xml:space="preserve">## X7            1.2826     0.6155   2.084 0.039950 *  </w:t>
+      </w:r>
+      <w:r>
+        <w:br/>
+      </w:r>
+      <w:r>
+        <w:rPr>
+          <w:rStyle w:val="VerbatimChar"/>
+        </w:rPr>
+        <w:t xml:space="preserve">## X5            1.1386     0.7151   1.592 0.114777    </w:t>
+      </w:r>
+      <w:r>
+        <w:br/>
+      </w:r>
+      <w:r>
+        <w:rPr>
+          <w:rStyle w:val="VerbatimChar"/>
+        </w:rPr>
+        <w:t xml:space="preserve">## ---</w:t>
+      </w:r>
+      <w:r>
+        <w:br/>
+      </w:r>
+      <w:r>
+        <w:rPr>
+          <w:rStyle w:val="VerbatimChar"/>
+        </w:rPr>
+        <w:t xml:space="preserve">## Signif. codes:  0 '***' 0.001 '**' 0.01 '*' 0.05 '.' 0.1 ' ' 1</w:t>
+      </w:r>
+      <w:r>
+        <w:br/>
+      </w:r>
+      <w:r>
+        <w:rPr>
+          <w:rStyle w:val="VerbatimChar"/>
+        </w:rPr>
+        <w:t xml:space="preserve">## </w:t>
+      </w:r>
+      <w:r>
+        <w:br/>
+      </w:r>
+      <w:r>
+        <w:rPr>
+          <w:rStyle w:val="VerbatimChar"/>
+        </w:rPr>
+        <w:t xml:space="preserve">## Residual standard error: 6.24 on 92 degrees of freedom</w:t>
+      </w:r>
+      <w:r>
+        <w:br/>
+      </w:r>
+      <w:r>
+        <w:rPr>
+          <w:rStyle w:val="VerbatimChar"/>
+        </w:rPr>
+        <w:t xml:space="preserve">## Multiple R-squared:  0.6392, Adjusted R-squared:  0.6118 </w:t>
+      </w:r>
+      <w:r>
+        <w:br/>
+      </w:r>
+      <w:r>
+        <w:rPr>
+          <w:rStyle w:val="VerbatimChar"/>
+        </w:rPr>
+        <w:t xml:space="preserve">## F-statistic: 23.29 on 7 and 92 DF,  p-value: &lt; 2.2e-16</w:t>
+      </w:r>
+    </w:p>
+    <w:p>
+      <w:pPr>
+        <w:pStyle w:val="SourceCode"/>
+      </w:pPr>
+      <w:r>
+        <w:rPr>
+          <w:rStyle w:val="FunctionTok"/>
+        </w:rPr>
+        <w:t xml:space="preserve">formula</w:t>
       </w:r>
       <w:r>
         <w:rPr>
@@ -8269,262 +8435,6 @@
         <w:rPr>
           <w:rStyle w:val="VerbatimChar"/>
         </w:rPr>
-        <w:t xml:space="preserve">## </w:t>
-      </w:r>
-      <w:r>
-        <w:br/>
-      </w:r>
-      <w:r>
-        <w:rPr>
-          <w:rStyle w:val="VerbatimChar"/>
-        </w:rPr>
-        <w:t xml:space="preserve">## Call:</w:t>
-      </w:r>
-      <w:r>
-        <w:br/>
-      </w:r>
-      <w:r>
-        <w:rPr>
-          <w:rStyle w:val="VerbatimChar"/>
-        </w:rPr>
-        <w:t xml:space="preserve">## lm(formula = reformulate(if (length(selected) &gt; 0) selected else "1", </w:t>
-      </w:r>
-      <w:r>
-        <w:br/>
-      </w:r>
-      <w:r>
-        <w:rPr>
-          <w:rStyle w:val="VerbatimChar"/>
-        </w:rPr>
-        <w:t xml:space="preserve">##     response = "Y"), data = data)</w:t>
-      </w:r>
-      <w:r>
-        <w:br/>
-      </w:r>
-      <w:r>
-        <w:rPr>
-          <w:rStyle w:val="VerbatimChar"/>
-        </w:rPr>
-        <w:t xml:space="preserve">## </w:t>
-      </w:r>
-      <w:r>
-        <w:br/>
-      </w:r>
-      <w:r>
-        <w:rPr>
-          <w:rStyle w:val="VerbatimChar"/>
-        </w:rPr>
-        <w:t xml:space="preserve">## Residuals:</w:t>
-      </w:r>
-      <w:r>
-        <w:br/>
-      </w:r>
-      <w:r>
-        <w:rPr>
-          <w:rStyle w:val="VerbatimChar"/>
-        </w:rPr>
-        <w:t xml:space="preserve">##      Min       1Q   Median       3Q      Max </w:t>
-      </w:r>
-      <w:r>
-        <w:br/>
-      </w:r>
-      <w:r>
-        <w:rPr>
-          <w:rStyle w:val="VerbatimChar"/>
-        </w:rPr>
-        <w:t xml:space="preserve">## -16.9862  -4.5421   0.7744   4.0540  15.0699 </w:t>
-      </w:r>
-      <w:r>
-        <w:br/>
-      </w:r>
-      <w:r>
-        <w:rPr>
-          <w:rStyle w:val="VerbatimChar"/>
-        </w:rPr>
-        <w:t xml:space="preserve">## </w:t>
-      </w:r>
-      <w:r>
-        <w:br/>
-      </w:r>
-      <w:r>
-        <w:rPr>
-          <w:rStyle w:val="VerbatimChar"/>
-        </w:rPr>
-        <w:t xml:space="preserve">## Coefficients:</w:t>
-      </w:r>
-      <w:r>
-        <w:br/>
-      </w:r>
-      <w:r>
-        <w:rPr>
-          <w:rStyle w:val="VerbatimChar"/>
-        </w:rPr>
-        <w:t xml:space="preserve">##             Estimate Std. Error t value Pr(&gt;|t|)    </w:t>
-      </w:r>
-      <w:r>
-        <w:br/>
-      </w:r>
-      <w:r>
-        <w:rPr>
-          <w:rStyle w:val="VerbatimChar"/>
-        </w:rPr>
-        <w:t xml:space="preserve">## (Intercept)   1.4963     0.6695   2.235 0.027826 *  </w:t>
-      </w:r>
-      <w:r>
-        <w:br/>
-      </w:r>
-      <w:r>
-        <w:rPr>
-          <w:rStyle w:val="VerbatimChar"/>
-        </w:rPr>
-        <w:t xml:space="preserve">## X10           7.1034     0.6599  10.765  &lt; 2e-16 ***</w:t>
-      </w:r>
-      <w:r>
-        <w:br/>
-      </w:r>
-      <w:r>
-        <w:rPr>
-          <w:rStyle w:val="VerbatimChar"/>
-        </w:rPr>
-        <w:t xml:space="preserve">## X4           -2.5995     0.7703  -3.375 0.001084 ** </w:t>
-      </w:r>
-      <w:r>
-        <w:br/>
-      </w:r>
-      <w:r>
-        <w:rPr>
-          <w:rStyle w:val="VerbatimChar"/>
-        </w:rPr>
-        <w:t xml:space="preserve">## X13          -2.5217     0.6513  -3.872 0.000202 ***</w:t>
-      </w:r>
-      <w:r>
-        <w:br/>
-      </w:r>
-      <w:r>
-        <w:rPr>
-          <w:rStyle w:val="VerbatimChar"/>
-        </w:rPr>
-        <w:t xml:space="preserve">## X14          -1.5138     0.6565  -2.306 0.023376 *  </w:t>
-      </w:r>
-      <w:r>
-        <w:br/>
-      </w:r>
-      <w:r>
-        <w:rPr>
-          <w:rStyle w:val="VerbatimChar"/>
-        </w:rPr>
-        <w:t xml:space="preserve">## X1            1.7693     0.6780   2.610 0.010575 *  </w:t>
-      </w:r>
-      <w:r>
-        <w:br/>
-      </w:r>
-      <w:r>
-        <w:rPr>
-          <w:rStyle w:val="VerbatimChar"/>
-        </w:rPr>
-        <w:t xml:space="preserve">## X7            1.2826     0.6155   2.084 0.039950 *  </w:t>
-      </w:r>
-      <w:r>
-        <w:br/>
-      </w:r>
-      <w:r>
-        <w:rPr>
-          <w:rStyle w:val="VerbatimChar"/>
-        </w:rPr>
-        <w:t xml:space="preserve">## X5            1.1386     0.7151   1.592 0.114777    </w:t>
-      </w:r>
-      <w:r>
-        <w:br/>
-      </w:r>
-      <w:r>
-        <w:rPr>
-          <w:rStyle w:val="VerbatimChar"/>
-        </w:rPr>
-        <w:t xml:space="preserve">## ---</w:t>
-      </w:r>
-      <w:r>
-        <w:br/>
-      </w:r>
-      <w:r>
-        <w:rPr>
-          <w:rStyle w:val="VerbatimChar"/>
-        </w:rPr>
-        <w:t xml:space="preserve">## Signif. codes:  0 '***' 0.001 '**' 0.01 '*' 0.05 '.' 0.1 ' ' 1</w:t>
-      </w:r>
-      <w:r>
-        <w:br/>
-      </w:r>
-      <w:r>
-        <w:rPr>
-          <w:rStyle w:val="VerbatimChar"/>
-        </w:rPr>
-        <w:t xml:space="preserve">## </w:t>
-      </w:r>
-      <w:r>
-        <w:br/>
-      </w:r>
-      <w:r>
-        <w:rPr>
-          <w:rStyle w:val="VerbatimChar"/>
-        </w:rPr>
-        <w:t xml:space="preserve">## Residual standard error: 6.24 on 92 degrees of freedom</w:t>
-      </w:r>
-      <w:r>
-        <w:br/>
-      </w:r>
-      <w:r>
-        <w:rPr>
-          <w:rStyle w:val="VerbatimChar"/>
-        </w:rPr>
-        <w:t xml:space="preserve">## Multiple R-squared:  0.6392, Adjusted R-squared:  0.6118 </w:t>
-      </w:r>
-      <w:r>
-        <w:br/>
-      </w:r>
-      <w:r>
-        <w:rPr>
-          <w:rStyle w:val="VerbatimChar"/>
-        </w:rPr>
-        <w:t xml:space="preserve">## F-statistic: 23.29 on 7 and 92 DF,  p-value: &lt; 2.2e-16</w:t>
-      </w:r>
-    </w:p>
-    <w:p>
-      <w:pPr>
-        <w:pStyle w:val="SourceCode"/>
-      </w:pPr>
-      <w:r>
-        <w:rPr>
-          <w:rStyle w:val="FunctionTok"/>
-        </w:rPr>
-        <w:t xml:space="preserve">formula</w:t>
-      </w:r>
-      <w:r>
-        <w:rPr>
-          <w:rStyle w:val="NormalTok"/>
-        </w:rPr>
-        <w:t xml:space="preserve">(stepwise_Cp</w:t>
-      </w:r>
-      <w:r>
-        <w:rPr>
-          <w:rStyle w:val="SpecialCharTok"/>
-        </w:rPr>
-        <w:t xml:space="preserve">$</w:t>
-      </w:r>
-      <w:r>
-        <w:rPr>
-          <w:rStyle w:val="NormalTok"/>
-        </w:rPr>
-        <w:t xml:space="preserve">model)</w:t>
-      </w:r>
-    </w:p>
-    <w:p>
-      <w:pPr>
-        <w:pStyle w:val="SourceCode"/>
-      </w:pPr>
-      <w:r>
-        <w:rPr>
-          <w:rStyle w:val="VerbatimChar"/>
-        </w:rPr>
         <w:t xml:space="preserve">## Y ~ X10 + X4 + X13 + X14 + X1 + X7 + X5</w:t>
       </w:r>
       <w:r>
@@ -8534,7 +8444,7 @@
         <w:rPr>
           <w:rStyle w:val="VerbatimChar"/>
         </w:rPr>
-        <w:t xml:space="preserve">## &lt;environment: 0x556697a69fb0&gt;</w:t>
+        <w:t xml:space="preserve">## &lt;environment: 0x558dbf0de430&gt;</w:t>
       </w:r>
     </w:p>
     <w:p>
@@ -9698,16 +9608,7 @@
         <w:rPr>
           <w:rStyle w:val="VerbatimChar"/>
         </w:rPr>
-        <w:t xml:space="preserve">## lm(formula = reformulate(if (length(selected) &gt; 0) selected else "1", </w:t>
-      </w:r>
-      <w:r>
-        <w:br/>
-      </w:r>
-      <w:r>
-        <w:rPr>
-          <w:rStyle w:val="VerbatimChar"/>
-        </w:rPr>
-        <w:t xml:space="preserve">##     response = "Y"), data = data)</w:t>
+        <w:t xml:space="preserve">## lm(formula = reformulate(selected, response = "Y"), data = data)</w:t>
       </w:r>
       <w:r>
         <w:br/>
@@ -9954,7 +9855,7 @@
         <w:rPr>
           <w:rStyle w:val="VerbatimChar"/>
         </w:rPr>
-        <w:t xml:space="preserve">## &lt;environment: 0x556699caa1f0&gt;</w:t>
+        <w:t xml:space="preserve">## &lt;environment: 0x558dc12b85b0&gt;</w:t>
       </w:r>
     </w:p>
     <w:p>

</xml_diff>